<commit_message>
docs: update documentation, add system diagrams, and refine heuristic and reporting modules
</commit_message>
<xml_diff>
--- a/docs/Chap_1_2_3_Eunice.docx
+++ b/docs/Chap_1_2_3_Eunice.docx
@@ -7981,17 +7981,20 @@
           <w:right w:val="nil"/>
           <w:between w:val="nil"/>
         </w:pBdr>
-        <w:spacing w:before="180" w:after="180" w:line="360" w:lineRule="auto"/>
-        <w:jc w:val="both"/>
-        <w:rPr>
-          <w:color w:val="000000"/>
-        </w:rPr>
-      </w:pPr>
-      <w:r>
-        <w:rPr>
-          <w:color w:val="000000"/>
-        </w:rPr>
-        <w:t>This chapter explains how the research and system development were done. It describes the research methodology requirements analysis, tools and technologies system design, algorithm description, dataset properties, testing strategy and ethical considerations for the SLA-Aware Storage Resource Allocation Optimizer.</w:t>
+        <w:spacing w:before="0" w:after="120" w:line="360" w:lineRule="auto"/>
+        <w:jc w:val="both"/>
+        <w:rPr>
+          <w:color w:val="000000"/>
+        </w:rPr>
+      </w:pPr>
+      <w:r/>
+      <w:r>
+        <w:rPr>
+          <w:rFonts w:ascii="Times New Roman" w:hAnsi="Times New Roman"/>
+          <w:color w:val="000000"/>
+          <w:sz w:val="24"/>
+        </w:rPr>
+        <w:t>This chapter presents the comprehensive research methodology, system design, architectural framework, and algorithmic logic for the SLA-Aware Cloud Storage Resource Allocation Optimizer. Section 3.1 details the research methodology, including the Design Science Research (DSR) framework, simulation-based data collection, and Agile Scrum sprint cycles. Section 3.2 outlines the functional and non-functional system requirements. Section 3.3 presents the software architecture, tool stack, and multi-tier component dependencies. Section 3.4 illustrates the structural and behavioral system design models, including architectural diagrams, use case interactions, relational database design (ERD), operational activity flow, and user interface designs. Section 3.5 provides the mathematical formulation, algorithmic pseudo-code, and procedural flow of the proposed multi-objective heuristic model alongside comparative baseline algorithms and workload estimation engines. Section 3.6 describes the dataset properties, schema definitions, and data preprocessing steps. Section 3.7 presents the comprehensive validation and multi-level testing plan. Finally, Section 3.8 addresses ethical considerations, focusing on data privacy, consent, and application security.</w:t>
       </w:r>
     </w:p>
     <w:p>
@@ -8014,6 +8017,32 @@
           <w:color w:val="000000"/>
         </w:rPr>
         <w:t xml:space="preserve"> </w:t>
+      </w:r>
+    </w:p>
+    <w:p>
+      <w:pPr>
+        <w:spacing w:before="0" w:after="120" w:line="360" w:lineRule="auto"/>
+      </w:pPr>
+      <w:r/>
+      <w:r>
+        <w:rPr>
+          <w:rFonts w:ascii="Times New Roman" w:hAnsi="Times New Roman"/>
+          <w:color w:val="000000"/>
+          <w:sz w:val="24"/>
+        </w:rPr>
+        <w:t>The SLA-Aware Cloud Storage Resource Allocation Optimizer is an automated decision-support framework engineered to solve the complex multi-objective storage allocation problem faced by cloud tenants and infrastructure architects. In modern enterprise IT environments, selecting an optimal storage tier is challenging because public cloud service providers (such as AWS, Azure, and Google Cloud) offer storage products with fundamentally divergent physical performance profiles, contractual uptime guarantees, and pricing structures. High-performance tiers such as Ultra High-Performance NVMe Block Storage deliver ultra-low access latencies (0.5 ms) and high availability guarantees (99.9999% uptime), but incur high monthly unit costs (0.250 per GB). Conversely, low-cost Object Storage offers economical pricing (0.023 per GB per month), but imposes higher access latencies (25.0 ms) and lower availability guarantees (99.9%). Without an automated optimization system, storage administrators typically rely on static rules, leading to either costly financial over-provisioning or severe Service Level Agreement (SLA) violations that disrupt business operations.</w:t>
+        <w:br/>
+        <w:br/>
+        <w:t>To eliminate manual guesswork and guarantee SLA compliance, the system bases its allocation decisions on four primary parameters: Maximum Tolerable Access Latency (Latency_req in ms), Availability SLA Target (SLA_req in %), Cost Optimization Weight (α, Alpha), and optional Monthly Budget Constraint (B in USD). The first two parameters represent hard physical and operational constraints. Access latency measures hardware responsiveness; if a high-throughput transactional database requires latency under 2.0 ms, Object Storage (25.0 ms) is physically incapable of supporting the workload and is immediately disqualified. Similarly, SLA availability defines allowable annual downtime. Any cloud storage tier providing an uptime guarantee below SLA_req is excluded to prevent contractual non-compliance.</w:t>
+        <w:br/>
+        <w:br/>
+        <w:t>The third parameter, Cost Optimization Weight (α), addresses the economic challenge of balancing monetary expenditure ($) against uptime reliability (%). Because storage cost is an objective to be minimized while availability is an objective to be maximized, the algorithm converts availability into an unavailability fraction: U_i = 1.0 – (SLA_i / 100.0). This aligns both metrics into a unified minimizability framework. The weight coefficient α (configurable between 0.0 and 1.0) allows infrastructure managers to customize allocation priorities. Setting a high Alpha (α → 1.0) prioritizes aggressive cost reduction, selecting the cheapest compliant tier. Setting a low Alpha (α → 0.0) prioritizes maximum availability, selecting the most resilient tier regardless of cost. Setting α = 0.5 establishes an equal balance between cost savings and uptime safety, with companion weight β = 1.0 – α.</w:t>
+        <w:br/>
+        <w:br/>
+        <w:t>The fourth parameter, Monthly Budget Constraint (B), enforces financial bounds: C_i = cost_per_gb_i × S_req. If total cost C_i exceeds B, the tier is removed from the feasible set. In scenarios where no single storage tier can satisfy all latency, SLA, and budget requirements simultaneously, the system terminates safely with an explicit exception dialog detailing closest available options.</w:t>
+        <w:br/>
+        <w:br/>
+        <w:t>System implementation follows a Three-Tier Software Architecture: Presentation Layer (Streamlit web interface), Application Logic Layer (heuristic.py), and Data Layer (database.py with SQLite storage_allocation.db). To empirically prove optimization performance, the system simultaneously benchmarks its heuristic recommendations against three traditional baseline algorithms: First Fit (FF), Best Fit (BF), and Worst Fit (WF).</w:t>
       </w:r>
     </w:p>
     <w:p>
@@ -9900,50 +9929,176 @@
     <w:p>
       <w:pPr>
         <w:pStyle w:val="Heading2"/>
-        <w:spacing w:before="0" w:after="0" w:line="360" w:lineRule="auto"/>
-        <w:jc w:val="both"/>
-        <w:rPr>
-          <w:b/>
-          <w:bCs/>
-          <w:color w:val="000000"/>
-        </w:rPr>
-      </w:pPr>
-      <w:bookmarkStart w:id="87" w:name="j8jh9xweoecv" w:colFirst="0" w:colLast="0"/>
-      <w:bookmarkStart w:id="88" w:name="_Toc235802057"/>
-      <w:bookmarkEnd w:id="87"/>
-      <w:r>
-        <w:rPr>
-          <w:b/>
-          <w:bCs/>
-          <w:color w:val="000000"/>
+        <w:spacing w:before="280" w:after="120" w:line="360" w:lineRule="auto"/>
+        <w:jc w:val="both"/>
+        <w:rPr>
+          <w:b/>
+          <w:bCs/>
+          <w:color w:val="000000"/>
+        </w:rPr>
+      </w:pPr>
+      <w:r/>
+      <w:r>
+        <w:rPr>
+          <w:rFonts w:ascii="Times New Roman" w:hAnsi="Times New Roman"/>
+          <w:b/>
+          <w:color w:val="000000"/>
+          <w:sz w:val="28"/>
         </w:rPr>
         <w:t>3.5 Algorithm / Model Description</w:t>
       </w:r>
-      <w:bookmarkEnd w:id="88"/>
+    </w:p>
+    <w:p>
+      <w:pPr>
+        <w:keepNext/>
+        <w:spacing w:before="280" w:after="80"/>
+        <w:jc w:val="center"/>
+      </w:pPr>
+      <w:r>
+        <w:drawing>
+          <wp:inline xmlns:a="http://schemas.openxmlformats.org/drawingml/2006/main" xmlns:pic="http://schemas.openxmlformats.org/drawingml/2006/picture">
+            <wp:extent cx="5303520" cy="3369295"/>
+            <wp:docPr id="6" name="Picture 6"/>
+            <wp:cNvGraphicFramePr>
+              <a:graphicFrameLocks noChangeAspect="1"/>
+            </wp:cNvGraphicFramePr>
+            <a:graphic>
+              <a:graphicData uri="http://schemas.openxmlformats.org/drawingml/2006/picture">
+                <pic:pic>
+                  <pic:nvPicPr>
+                    <pic:cNvPr id="0" name="figure_3_6_algorithm_pseudocode.png"/>
+                    <pic:cNvPicPr/>
+                  </pic:nvPicPr>
+                  <pic:blipFill>
+                    <a:blip r:embed="rId19"/>
+                    <a:stretch>
+                      <a:fillRect/>
+                    </a:stretch>
+                  </pic:blipFill>
+                  <pic:spPr>
+                    <a:xfrm>
+                      <a:off x="0" y="0"/>
+                      <a:ext cx="5303520" cy="3369295"/>
+                    </a:xfrm>
+                    <a:prstGeom prst="rect"/>
+                  </pic:spPr>
+                </pic:pic>
+              </a:graphicData>
+            </a:graphic>
+          </wp:inline>
+        </w:drawing>
+      </w:r>
+    </w:p>
+    <w:p>
+      <w:pPr>
+        <w:keepNext/>
+        <w:spacing w:before="280" w:after="80"/>
+        <w:jc w:val="center"/>
+      </w:pPr>
+      <w:r>
+        <w:drawing>
+          <wp:inline xmlns:a="http://schemas.openxmlformats.org/drawingml/2006/main" xmlns:pic="http://schemas.openxmlformats.org/drawingml/2006/picture">
+            <wp:extent cx="5303520" cy="4068385"/>
+            <wp:docPr id="18" name="Picture 18"/>
+            <wp:cNvGraphicFramePr>
+              <a:graphicFrameLocks noChangeAspect="1"/>
+            </wp:cNvGraphicFramePr>
+            <a:graphic>
+              <a:graphicData uri="http://schemas.openxmlformats.org/drawingml/2006/picture">
+                <pic:pic>
+                  <pic:nvPicPr>
+                    <pic:cNvPr id="0" name="algorithm_3_1_pseudocode.png"/>
+                    <pic:cNvPicPr/>
+                  </pic:nvPicPr>
+                  <pic:blipFill>
+                    <a:blip r:embed="rId26"/>
+                    <a:stretch>
+                      <a:fillRect/>
+                    </a:stretch>
+                  </pic:blipFill>
+                  <pic:spPr>
+                    <a:xfrm>
+                      <a:off x="0" y="0"/>
+                      <a:ext cx="5303520" cy="4068385"/>
+                    </a:xfrm>
+                    <a:prstGeom prst="rect"/>
+                  </pic:spPr>
+                </pic:pic>
+              </a:graphicData>
+            </a:graphic>
+          </wp:inline>
+        </w:drawing>
+      </w:r>
+    </w:p>
+    <w:p>
+      <w:pPr>
+        <w:spacing w:before="40" w:after="280"/>
+        <w:jc w:val="center"/>
+      </w:pPr>
+      <w:r>
+        <w:rPr>
+          <w:rFonts w:ascii="Times New Roman" w:hAnsi="Times New Roman"/>
+          <w:b/>
+          <w:color w:val="000000"/>
+          <w:sz w:val="20"/>
+        </w:rPr>
+        <w:t xml:space="preserve">Figure 3.7: </w:t>
+      </w:r>
+      <w:r>
+        <w:rPr>
+          <w:rFonts w:ascii="Times New Roman" w:hAnsi="Times New Roman"/>
+          <w:i/>
+          <w:color w:val="000000"/>
+          <w:sz w:val="20"/>
+        </w:rPr>
+        <w:t>Screenshot Image of Algorithm 3.1: Pseudocode Logic of Core SLA-Aware Dual-Objective Heuristic Model.</w:t>
+      </w:r>
+    </w:p>
+    <w:p>
+      <w:pPr>
+        <w:spacing w:before="40" w:after="280"/>
+        <w:jc w:val="center"/>
+      </w:pPr>
+      <w:r>
+        <w:rPr>
+          <w:rFonts w:ascii="Times New Roman" w:hAnsi="Times New Roman"/>
+          <w:b/>
+          <w:color w:val="000000"/>
+          <w:sz w:val="20"/>
+        </w:rPr>
+        <w:t xml:space="preserve">Figure 3.7: </w:t>
+      </w:r>
+      <w:r>
+        <w:rPr>
+          <w:rFonts w:ascii="Times New Roman" w:hAnsi="Times New Roman"/>
+          <w:i/>
+          <w:color w:val="000000"/>
+          <w:sz w:val="20"/>
+        </w:rPr>
+        <w:t>Screenshot Image of Algorithm 3.1: Pseudocode Logic of the Core SLA-Aware Dual-Objective Storage Allocation Algorithm.</w:t>
+      </w:r>
     </w:p>
     <w:p>
       <w:pPr>
         <w:pStyle w:val="Heading3"/>
-        <w:spacing w:before="0" w:after="0" w:line="360" w:lineRule="auto"/>
-        <w:jc w:val="both"/>
-        <w:rPr>
-          <w:b/>
-          <w:bCs/>
-          <w:color w:val="000000"/>
-        </w:rPr>
-      </w:pPr>
-      <w:bookmarkStart w:id="89" w:name="4tqlrzotjnsw" w:colFirst="0" w:colLast="0"/>
-      <w:bookmarkStart w:id="90" w:name="_Toc235802058"/>
-      <w:bookmarkEnd w:id="89"/>
-      <w:r>
-        <w:rPr>
-          <w:b/>
-          <w:bCs/>
-          <w:color w:val="000000"/>
-        </w:rPr>
-        <w:t>3.5.1 Algorithm</w:t>
-      </w:r>
-      <w:bookmarkEnd w:id="90"/>
+        <w:spacing w:before="240" w:after="80" w:line="360" w:lineRule="auto"/>
+        <w:jc w:val="both"/>
+        <w:rPr>
+          <w:b/>
+          <w:bCs/>
+          <w:color w:val="000000"/>
+        </w:rPr>
+      </w:pPr>
+      <w:r/>
+      <w:r>
+        <w:rPr>
+          <w:rFonts w:ascii="Times New Roman" w:hAnsi="Times New Roman"/>
+          <w:b/>
+          <w:color w:val="000000"/>
+          <w:sz w:val="25"/>
+        </w:rPr>
+        <w:t>3.5.1 Overview and Decision Principles</w:t>
+      </w:r>
     </w:p>
     <w:p>
       <w:pPr>
@@ -9954,31 +10109,20 @@
           <w:right w:val="nil"/>
           <w:between w:val="nil"/>
         </w:pBdr>
-        <w:spacing w:line="360" w:lineRule="auto"/>
-        <w:jc w:val="both"/>
-        <w:rPr>
-          <w:color w:val="000000"/>
-        </w:rPr>
-      </w:pPr>
-      <w:r>
-        <w:rPr>
-          <w:color w:val="000000"/>
-        </w:rPr>
-        <w:t xml:space="preserve">The proposed system uses a </w:t>
-      </w:r>
-      <w:r>
-        <w:rPr>
-          <w:b/>
-          <w:bCs/>
-          <w:color w:val="000000"/>
-        </w:rPr>
-        <w:t>multi-objective greedy scoring heuristic</w:t>
-      </w:r>
-      <w:r>
-        <w:rPr>
-          <w:color w:val="000000"/>
-        </w:rPr>
-        <w:t>. Cost and unavailability are normalized via Min-Max scaling to ensure that difference in units ($ vs %) does not distort the score:</w:t>
+        <w:spacing w:line="360" w:lineRule="auto" w:before="0" w:after="120"/>
+        <w:jc w:val="both"/>
+        <w:rPr>
+          <w:color w:val="000000"/>
+        </w:rPr>
+      </w:pPr>
+      <w:r/>
+      <w:r>
+        <w:rPr>
+          <w:rFonts w:ascii="Times New Roman" w:hAnsi="Times New Roman"/>
+          <w:color w:val="000000"/>
+          <w:sz w:val="24"/>
+        </w:rPr>
+        <w:t>The proposed cloud storage allocation system operationalizes a multi-objective greedy scoring heuristic designed to balance operational expenditures (cost optimization weight α) against Service Level Agreement availability risks (unavailability weight β = 1.0 – α). Because cost (measured in USD) and availability (measured in percentage SLA) operate on fundamentally different numerical scales, direct linear combinations would distort decision-making. The proposed model applies Min-Max vector normalization across all candidate storage tiers to transform both cost and unavailability metrics into standard dimensionless intervals [0, 1] prior to weighted score aggregation.</w:t>
       </w:r>
     </w:p>
     <w:p>
@@ -9990,13 +10134,23 @@
           <w:right w:val="nil"/>
           <w:between w:val="nil"/>
         </w:pBdr>
-        <w:spacing w:line="360" w:lineRule="auto"/>
+        <w:spacing w:line="360" w:lineRule="auto" w:before="240" w:after="80"/>
         <w:ind w:left="720"/>
         <w:jc w:val="both"/>
         <w:rPr>
           <w:color w:val="000000"/>
         </w:rPr>
       </w:pPr>
+      <w:r/>
+      <w:r>
+        <w:rPr>
+          <w:rFonts w:ascii="Times New Roman" w:hAnsi="Times New Roman"/>
+          <w:b/>
+          <w:color w:val="000000"/>
+          <w:sz w:val="25"/>
+        </w:rPr>
+        <w:t>3.5.2 Mathematical Model and Formulation</w:t>
+      </w:r>
     </w:p>
     <w:p>
       <w:pPr>
@@ -10007,13 +10161,22 @@
           <w:right w:val="nil"/>
           <w:between w:val="nil"/>
         </w:pBdr>
-        <w:spacing w:line="360" w:lineRule="auto"/>
+        <w:spacing w:line="360" w:lineRule="auto" w:before="0" w:after="120"/>
         <w:ind w:left="720"/>
         <w:jc w:val="both"/>
         <w:rPr>
           <w:color w:val="000000"/>
         </w:rPr>
       </w:pPr>
+      <w:r/>
+      <w:r>
+        <w:rPr>
+          <w:rFonts w:ascii="Times New Roman" w:hAnsi="Times New Roman"/>
+          <w:color w:val="000000"/>
+          <w:sz w:val="24"/>
+        </w:rPr>
+        <w:t>The decision framework is formalized through the following mathematical formulation:</w:t>
+      </w:r>
     </w:p>
     <w:p>
       <w:pPr>
@@ -10024,17 +10187,20 @@
           <w:right w:val="nil"/>
           <w:between w:val="nil"/>
         </w:pBdr>
-        <w:spacing w:line="360" w:lineRule="auto"/>
-        <w:jc w:val="both"/>
-        <w:rPr>
-          <w:color w:val="000000"/>
-        </w:rPr>
-      </w:pPr>
-      <w:r>
-        <w:rPr>
-          <w:color w:val="000000"/>
-        </w:rPr>
-        <w:t>Where:</w:t>
+        <w:spacing w:line="360" w:lineRule="auto" w:before="0" w:after="120"/>
+        <w:jc w:val="both"/>
+        <w:rPr>
+          <w:color w:val="000000"/>
+        </w:rPr>
+      </w:pPr>
+      <w:r/>
+      <w:r>
+        <w:rPr>
+          <w:rFonts w:ascii="Times New Roman" w:hAnsi="Times New Roman"/>
+          <w:color w:val="000000"/>
+          <w:sz w:val="24"/>
+        </w:rPr>
+        <w:t>1. Total Cost Estimation: For candidate storage tier i ∈ T with unit cost cost_per_gb_i ($/GB) and requested capacity S_req (GB), total monthly operational cost C_i is calculated as:</w:t>
       </w:r>
     </w:p>
     <w:p>
@@ -10046,32 +10212,22 @@
           <w:right w:val="nil"/>
           <w:between w:val="nil"/>
         </w:pBdr>
-        <w:spacing w:line="360" w:lineRule="auto"/>
-        <w:jc w:val="both"/>
-        <w:rPr>
-          <w:color w:val="000000"/>
-        </w:rPr>
-      </w:pPr>
-      <w:r>
-        <w:rPr>
-          <w:color w:val="000000"/>
-        </w:rPr>
-        <w:t xml:space="preserve">The final score for storage tier </w:t>
-      </w:r>
-      <m:oMath>
-        <m:r>
-          <w:rPr>
-            <w:rFonts w:ascii="Aptos" w:eastAsia="Aptos" w:hAnsi="Aptos" w:cs="Aptos"/>
-            <w:color w:val="000000"/>
-          </w:rPr>
-          <m:t>i</m:t>
-        </m:r>
-      </m:oMath>
-      <w:r>
-        <w:rPr>
-          <w:color w:val="000000"/>
-        </w:rPr>
-        <w:t xml:space="preserve"> is:</w:t>
+        <w:spacing w:line="276" w:lineRule="auto" w:before="80" w:after="120"/>
+        <w:jc w:val="center"/>
+        <w:rPr>
+          <w:color w:val="000000"/>
+        </w:rPr>
+      </w:pPr>
+      <w:r/>
+      <w:r>
+        <w:rPr>
+          <w:rFonts w:ascii="Times New Roman" w:hAnsi="Times New Roman"/>
+          <w:b/>
+          <w:i/>
+          <w:color w:val="000000"/>
+          <w:sz w:val="22"/>
+        </w:rPr>
+        <w:t>C_i = cost_per_gb_i × S_req</w:t>
       </w:r>
     </w:p>
     <w:p>
@@ -10083,13 +10239,22 @@
           <w:right w:val="nil"/>
           <w:between w:val="nil"/>
         </w:pBdr>
-        <w:spacing w:line="360" w:lineRule="auto"/>
+        <w:spacing w:line="360" w:lineRule="auto" w:before="0" w:after="120"/>
         <w:ind w:left="720"/>
         <w:jc w:val="both"/>
         <w:rPr>
           <w:color w:val="000000"/>
         </w:rPr>
       </w:pPr>
+      <w:r/>
+      <w:r>
+        <w:rPr>
+          <w:rFonts w:ascii="Times New Roman" w:hAnsi="Times New Roman"/>
+          <w:color w:val="000000"/>
+          <w:sz w:val="24"/>
+        </w:rPr>
+        <w:t>2. Unavailability Risk Conversion: Percentage availability SLA_i (%) is transformed into unavailability fraction U_i for minimizability:</w:t>
+      </w:r>
     </w:p>
     <w:p>
       <w:pPr>
@@ -10100,17 +10265,22 @@
           <w:right w:val="nil"/>
           <w:between w:val="nil"/>
         </w:pBdr>
-        <w:spacing w:line="360" w:lineRule="auto"/>
-        <w:jc w:val="both"/>
-        <w:rPr>
-          <w:color w:val="000000"/>
-        </w:rPr>
-      </w:pPr>
-      <w:r>
-        <w:rPr>
-          <w:color w:val="000000"/>
-        </w:rPr>
-        <w:t>Subject to:</w:t>
+        <w:spacing w:line="276" w:lineRule="auto" w:before="80" w:after="120"/>
+        <w:jc w:val="center"/>
+        <w:rPr>
+          <w:color w:val="000000"/>
+        </w:rPr>
+      </w:pPr>
+      <w:r/>
+      <w:r>
+        <w:rPr>
+          <w:rFonts w:ascii="Times New Roman" w:hAnsi="Times New Roman"/>
+          <w:b/>
+          <w:i/>
+          <w:color w:val="000000"/>
+          <w:sz w:val="22"/>
+        </w:rPr>
+        <w:t>U_i = 1.0 – (SLA_i / 100.0)</w:t>
       </w:r>
     </w:p>
     <w:p>
@@ -10122,13 +10292,22 @@
           <w:right w:val="nil"/>
           <w:between w:val="nil"/>
         </w:pBdr>
-        <w:spacing w:line="360" w:lineRule="auto"/>
+        <w:spacing w:line="360" w:lineRule="auto" w:before="0" w:after="120"/>
         <w:ind w:left="720"/>
         <w:jc w:val="both"/>
         <w:rPr>
           <w:color w:val="000000"/>
         </w:rPr>
       </w:pPr>
+      <w:r/>
+      <w:r>
+        <w:rPr>
+          <w:rFonts w:ascii="Times New Roman" w:hAnsi="Times New Roman"/>
+          <w:color w:val="000000"/>
+          <w:sz w:val="24"/>
+        </w:rPr>
+        <w:t>3. Feasible Candidate Tier Pre-Filtering: Candidate tier set T is filtered against hard SLA availability target SLA_req (%), maximum tolerable latency Latency_req (ms), and optional budget bound B ($) to yield feasible subset E:</w:t>
+      </w:r>
     </w:p>
     <w:p>
       <w:pPr>
@@ -10139,13 +10318,24 @@
           <w:right w:val="nil"/>
           <w:between w:val="nil"/>
         </w:pBdr>
-        <w:spacing w:line="360" w:lineRule="auto"/>
+        <w:spacing w:line="276" w:lineRule="auto" w:before="80" w:after="120"/>
         <w:ind w:left="720"/>
-        <w:jc w:val="both"/>
-        <w:rPr>
-          <w:color w:val="000000"/>
-        </w:rPr>
-      </w:pPr>
+        <w:jc w:val="center"/>
+        <w:rPr>
+          <w:color w:val="000000"/>
+        </w:rPr>
+      </w:pPr>
+      <w:r/>
+      <w:r>
+        <w:rPr>
+          <w:rFonts w:ascii="Times New Roman" w:hAnsi="Times New Roman"/>
+          <w:b/>
+          <w:i/>
+          <w:color w:val="000000"/>
+          <w:sz w:val="22"/>
+        </w:rPr>
+        <w:t>E = { i ∈ T | SLA_i ≥ SLA_req  ∧  Latency_i ≤ Latency_req  ∧  (B is NULL  ∨  C_i ≤ B) }</w:t>
+      </w:r>
     </w:p>
     <w:p>
       <w:pPr>
@@ -10156,13 +10346,22 @@
           <w:right w:val="nil"/>
           <w:between w:val="nil"/>
         </w:pBdr>
-        <w:spacing w:line="360" w:lineRule="auto"/>
+        <w:spacing w:line="360" w:lineRule="auto" w:before="0" w:after="120"/>
         <w:ind w:left="720"/>
         <w:jc w:val="both"/>
         <w:rPr>
           <w:color w:val="000000"/>
         </w:rPr>
       </w:pPr>
+      <w:r/>
+      <w:r>
+        <w:rPr>
+          <w:rFonts w:ascii="Times New Roman" w:hAnsi="Times New Roman"/>
+          <w:color w:val="000000"/>
+          <w:sz w:val="24"/>
+        </w:rPr>
+        <w:t>4. Min-Max Vector Normalization: Cost bounds C_min = min_{i ∈ E}(C_i), C_max = max_{i ∈ E}(C_i) and unavailability bounds U_min = min_{i ∈ E}(U_i), U_max = max_{i ∈ E}(U_i) scale candidate metrics into normalized scores C_norm(i) and U_norm(i):</w:t>
+      </w:r>
     </w:p>
     <w:p>
       <w:pPr>
@@ -10173,13 +10372,24 @@
           <w:right w:val="nil"/>
           <w:between w:val="nil"/>
         </w:pBdr>
-        <w:spacing w:line="360" w:lineRule="auto"/>
+        <w:spacing w:line="276" w:lineRule="auto" w:before="80" w:after="120"/>
         <w:ind w:left="720"/>
-        <w:jc w:val="both"/>
-        <w:rPr>
-          <w:color w:val="000000"/>
-        </w:rPr>
-      </w:pPr>
+        <w:jc w:val="center"/>
+        <w:rPr>
+          <w:color w:val="000000"/>
+        </w:rPr>
+      </w:pPr>
+      <w:r/>
+      <w:r>
+        <w:rPr>
+          <w:rFonts w:ascii="Times New Roman" w:hAnsi="Times New Roman"/>
+          <w:b/>
+          <w:i/>
+          <w:color w:val="000000"/>
+          <w:sz w:val="22"/>
+        </w:rPr>
+        <w:t>C_norm(i) = (C_i – C_min) / (C_max – C_min)   if (C_max &gt; C_min) else 0.0</w:t>
+      </w:r>
     </w:p>
     <w:p>
       <w:pPr>
@@ -10190,17 +10400,22 @@
           <w:right w:val="nil"/>
           <w:between w:val="nil"/>
         </w:pBdr>
-        <w:spacing w:line="360" w:lineRule="auto"/>
-        <w:jc w:val="both"/>
-        <w:rPr>
-          <w:color w:val="000000"/>
-        </w:rPr>
-      </w:pPr>
-      <w:r>
-        <w:rPr>
-          <w:color w:val="000000"/>
-        </w:rPr>
-        <w:t>The exact pseudocode logic of the core algorithm is described below:</w:t>
+        <w:spacing w:line="276" w:lineRule="auto" w:before="80" w:after="120"/>
+        <w:jc w:val="center"/>
+        <w:rPr>
+          <w:color w:val="000000"/>
+        </w:rPr>
+      </w:pPr>
+      <w:r/>
+      <w:r>
+        <w:rPr>
+          <w:rFonts w:ascii="Times New Roman" w:hAnsi="Times New Roman"/>
+          <w:b/>
+          <w:i/>
+          <w:color w:val="000000"/>
+          <w:sz w:val="22"/>
+        </w:rPr>
+        <w:t>U_norm(i) = (U_i – U_min) / (U_max – U_min)   if (U_max &gt; U_min) else 0.0</w:t>
       </w:r>
     </w:p>
     <w:p>
@@ -10212,33 +10427,108 @@
           <w:right w:val="nil"/>
           <w:between w:val="nil"/>
         </w:pBdr>
-        <w:spacing w:before="180" w:after="180" w:line="360" w:lineRule="auto"/>
-        <w:jc w:val="both"/>
-        <w:rPr>
-          <w:color w:val="000000"/>
-        </w:rPr>
-      </w:pPr>
-      <w:r>
-        <w:rPr>
-          <w:noProof/>
-          <w:color w:val="000000"/>
-        </w:rPr>
+        <w:spacing w:before="0" w:after="120" w:line="360" w:lineRule="auto"/>
+        <w:jc w:val="both"/>
+        <w:rPr>
+          <w:color w:val="000000"/>
+        </w:rPr>
+      </w:pPr>
+      <w:r/>
+      <w:r>
+        <w:rPr>
+          <w:rFonts w:ascii="Times New Roman" w:hAnsi="Times New Roman"/>
+          <w:color w:val="000000"/>
+          <w:sz w:val="24"/>
+        </w:rPr>
+        <w:t>5. Weighted Dual-Objective Scoring: Composite decision score S_i is computed using user-configured trade-off weights α ∈ [0.0, 1.0] and β = 1.0 – α:</w:t>
+      </w:r>
+    </w:p>
+    <w:p>
+      <w:pPr>
+        <w:spacing w:before="80" w:after="120" w:line="276" w:lineRule="auto"/>
+        <w:jc w:val="center"/>
+      </w:pPr>
+      <w:r/>
+      <w:r>
+        <w:rPr>
+          <w:rFonts w:ascii="Times New Roman" w:hAnsi="Times New Roman"/>
+          <w:b/>
+          <w:i/>
+          <w:color w:val="000000"/>
+          <w:sz w:val="22"/>
+        </w:rPr>
+        <w:t>S_i = α × C_norm(i) + β × U_norm(i)</w:t>
+      </w:r>
+    </w:p>
+    <w:p>
+      <w:pPr>
+        <w:spacing w:before="0" w:after="120" w:line="360" w:lineRule="auto"/>
+      </w:pPr>
+      <w:r/>
+      <w:r>
+        <w:rPr>
+          <w:rFonts w:ascii="Times New Roman" w:hAnsi="Times New Roman"/>
+          <w:color w:val="000000"/>
+          <w:sz w:val="24"/>
+        </w:rPr>
+        <w:t>6. Optimal Tier Selection: The storage tier i* yielding the lowest composite score is selected as the recommended allocation:</w:t>
+      </w:r>
+    </w:p>
+    <w:p>
+      <w:pPr>
+        <w:spacing w:before="80" w:after="120" w:line="276" w:lineRule="auto"/>
+        <w:jc w:val="center"/>
+      </w:pPr>
+      <w:r/>
+      <w:r>
+        <w:rPr>
+          <w:rFonts w:ascii="Times New Roman" w:hAnsi="Times New Roman"/>
+          <w:b/>
+          <w:i/>
+          <w:color w:val="000000"/>
+          <w:sz w:val="22"/>
+        </w:rPr>
+        <w:t>i* = argmin_{i ∈ E} (S_i)</w:t>
+      </w:r>
+    </w:p>
+    <w:p>
+      <w:pPr>
+        <w:spacing w:before="240" w:after="80" w:line="360" w:lineRule="auto"/>
+      </w:pPr>
+      <w:r/>
+      <w:r>
+        <w:rPr>
+          <w:rFonts w:ascii="Times New Roman" w:hAnsi="Times New Roman"/>
+          <w:b/>
+          <w:color w:val="000000"/>
+          <w:sz w:val="25"/>
+        </w:rPr>
+        <w:t>3.5.3 Proposed Heuristic Scoring Algorithm (Pseudo-Code)</w:t>
+      </w:r>
+    </w:p>
+    <w:p>
+      <w:pPr>
+        <w:keepNext/>
+        <w:spacing w:before="280" w:after="80"/>
+        <w:jc w:val="center"/>
+      </w:pPr>
+      <w:r>
         <w:drawing>
-          <wp:inline distT="0" distB="0" distL="114300" distR="114300" wp14:anchorId="7803FC94" wp14:editId="4BFDBFBD">
-            <wp:extent cx="5943600" cy="4324350"/>
-            <wp:effectExtent l="0" t="0" r="0" b="0"/>
-            <wp:docPr id="6" name="image3.png"/>
-            <wp:cNvGraphicFramePr/>
-            <a:graphic xmlns:a="http://schemas.openxmlformats.org/drawingml/2006/main">
+          <wp:inline xmlns:a="http://schemas.openxmlformats.org/drawingml/2006/main" xmlns:pic="http://schemas.openxmlformats.org/drawingml/2006/picture">
+            <wp:extent cx="5303520" cy="3369295"/>
+            <wp:docPr id="8" name="Picture 8"/>
+            <wp:cNvGraphicFramePr>
+              <a:graphicFrameLocks noChangeAspect="1"/>
+            </wp:cNvGraphicFramePr>
+            <a:graphic>
               <a:graphicData uri="http://schemas.openxmlformats.org/drawingml/2006/picture">
-                <pic:pic xmlns:pic="http://schemas.openxmlformats.org/drawingml/2006/picture">
+                <pic:pic>
                   <pic:nvPicPr>
-                    <pic:cNvPr id="0" name="image3.png"/>
-                    <pic:cNvPicPr preferRelativeResize="0"/>
+                    <pic:cNvPr id="0" name="image.png"/>
+                    <pic:cNvPicPr/>
                   </pic:nvPicPr>
                   <pic:blipFill>
-                    <a:blip r:embed="rId15"/>
-                    <a:srcRect/>
+                    <a:blip r:embed="rId19"/>
                     <a:stretch>
                       <a:fillRect/>
                     </a:stretch>
@@ -10246,12 +10536,9 @@
                   <pic:spPr>
                     <a:xfrm>
                       <a:off x="0" y="0"/>
-                      <a:ext cx="5943600" cy="4324350"/>
+                      <a:ext cx="5303520" cy="3369295"/>
                     </a:xfrm>
-                    <a:prstGeom prst="rect">
-                      <a:avLst/>
-                    </a:prstGeom>
-                    <a:ln/>
+                    <a:prstGeom prst="rect"/>
                   </pic:spPr>
                 </pic:pic>
               </a:graphicData>
@@ -10262,6 +10549,893 @@
     </w:p>
     <w:p>
       <w:pPr>
+        <w:spacing w:before="40" w:after="280"/>
+        <w:jc w:val="center"/>
+      </w:pPr>
+      <w:r>
+        <w:rPr>
+          <w:rFonts w:ascii="Times New Roman" w:hAnsi="Times New Roman"/>
+          <w:b/>
+          <w:color w:val="000000"/>
+          <w:sz w:val="20"/>
+        </w:rPr>
+        <w:t xml:space="preserve">Figure 3.7: </w:t>
+      </w:r>
+      <w:r>
+        <w:rPr>
+          <w:rFonts w:ascii="Times New Roman" w:hAnsi="Times New Roman"/>
+          <w:i/>
+          <w:color w:val="000000"/>
+          <w:sz w:val="20"/>
+        </w:rPr>
+        <w:t>Screenshot Image of Algorithm 3.1: Pseudocode Logic of Core SLA-Aware Dual-Objective Heuristic Model.</w:t>
+      </w:r>
+    </w:p>
+    <w:p>
+      <w:pPr>
+        <w:spacing w:before="0" w:after="120" w:line="360" w:lineRule="auto"/>
+      </w:pPr>
+      <w:r/>
+      <w:r>
+        <w:rPr>
+          <w:rFonts w:ascii="Times New Roman" w:hAnsi="Times New Roman"/>
+          <w:color w:val="000000"/>
+          <w:sz w:val="24"/>
+        </w:rPr>
+        <w:t>The procedural logic governing the proposed α-β dual-objective heuristic is formalized in Algorithm 3.1:</w:t>
+      </w:r>
+    </w:p>
+    <w:p>
+      <w:pPr>
+        <w:keepNext/>
+        <w:spacing w:before="280" w:after="80"/>
+        <w:jc w:val="center"/>
+      </w:pPr>
+      <w:r>
+        <w:drawing>
+          <wp:inline xmlns:a="http://schemas.openxmlformats.org/drawingml/2006/main" xmlns:pic="http://schemas.openxmlformats.org/drawingml/2006/picture">
+            <wp:extent cx="5303520" cy="3369295"/>
+            <wp:docPr id="9" name="Picture 9"/>
+            <wp:cNvGraphicFramePr>
+              <a:graphicFrameLocks noChangeAspect="1"/>
+            </wp:cNvGraphicFramePr>
+            <a:graphic>
+              <a:graphicData uri="http://schemas.openxmlformats.org/drawingml/2006/picture">
+                <pic:pic>
+                  <pic:nvPicPr>
+                    <pic:cNvPr id="0" name="image.png"/>
+                    <pic:cNvPicPr/>
+                  </pic:nvPicPr>
+                  <pic:blipFill>
+                    <a:blip r:embed="rId19"/>
+                    <a:stretch>
+                      <a:fillRect/>
+                    </a:stretch>
+                  </pic:blipFill>
+                  <pic:spPr>
+                    <a:xfrm>
+                      <a:off x="0" y="0"/>
+                      <a:ext cx="5303520" cy="3369295"/>
+                    </a:xfrm>
+                    <a:prstGeom prst="rect"/>
+                  </pic:spPr>
+                </pic:pic>
+              </a:graphicData>
+            </a:graphic>
+          </wp:inline>
+        </w:drawing>
+      </w:r>
+    </w:p>
+    <w:p>
+      <w:pPr>
+        <w:spacing w:before="40" w:after="280"/>
+        <w:jc w:val="center"/>
+      </w:pPr>
+      <w:r>
+        <w:rPr>
+          <w:rFonts w:ascii="Times New Roman" w:hAnsi="Times New Roman"/>
+          <w:b/>
+          <w:color w:val="000000"/>
+          <w:sz w:val="20"/>
+        </w:rPr>
+        <w:t xml:space="preserve">Figure 3.7: </w:t>
+      </w:r>
+      <w:r>
+        <w:rPr>
+          <w:rFonts w:ascii="Times New Roman" w:hAnsi="Times New Roman"/>
+          <w:i/>
+          <w:color w:val="000000"/>
+          <w:sz w:val="20"/>
+        </w:rPr>
+        <w:t>Screenshot Image of Algorithm 3.1: Pseudocode Logic of Core SLA-Aware Dual-Objective Heuristic Model.</w:t>
+      </w:r>
+    </w:p>
+    <w:p>
+      <w:pPr>
+        <w:spacing w:before="120" w:after="120" w:line="252" w:lineRule="auto"/>
+      </w:pPr>
+      <w:r/>
+      <w:r>
+        <w:rPr>
+          <w:rFonts w:ascii="Consolas" w:hAnsi="Consolas"/>
+          <w:color w:val="000000"/>
+          <w:sz w:val="19"/>
+        </w:rPr>
+        <w:t>Algorithm 3.1: Proposed α-β Dual-Objective Storage Allocation Algorithm</w:t>
+        <w:br/>
+        <w:t>----------------------------------------------------------------------------------------------------</w:t>
+        <w:br/>
+        <w:t>Input : Required Storage Capacity S_req (GB), Target SLA Availability SLA_req (%),</w:t>
+        <w:br/>
+        <w:t xml:space="preserve">        Max Tolerable Access Latency Latency_req (ms), Optional Budget Bound B ($),</w:t>
+        <w:br/>
+        <w:t xml:space="preserve">        Cost Optimization Weight α ∈ [0.0, 1.0], Availability Risk Weight β = 1.0 - α.</w:t>
+        <w:br/>
+        <w:t>Output: Recommended Tier i*, Monthly Cost Estimate C_i*, Availability SLA_i*,</w:t>
+        <w:br/>
+        <w:t xml:space="preserve">        Access Latency Latency_i*, Detailed Candidate Tier Scoring Breakdown Table.</w:t>
+        <w:br/>
+        <w:t>----------------------------------------------------------------------------------------------------</w:t>
+        <w:br/>
+        <w:t xml:space="preserve"> 1:  Retrieve candidate storage tier catalog T from relational database (storage_tiers table)</w:t>
+        <w:br/>
+        <w:t xml:space="preserve"> 2:  Initialize eligible candidate set E = Ø</w:t>
+        <w:br/>
+        <w:t xml:space="preserve"> 3:  FOR EACH storage tier i in T DO:</w:t>
+        <w:br/>
+        <w:t xml:space="preserve"> 4:      IF SLA_i &gt;= SLA_req AND Latency_i &lt;= Latency_req THEN</w:t>
+        <w:br/>
+        <w:t xml:space="preserve"> 5:          C_i = cost_per_gb_i * S_req</w:t>
+        <w:br/>
+        <w:t xml:space="preserve"> 6:          IF B is NULL OR B &lt;= 0.0 OR C_i &lt;= B THEN</w:t>
+        <w:br/>
+        <w:t xml:space="preserve"> 7:              Add tier i with metrics (C_i, SLA_i, Latency_i) to set E</w:t>
+        <w:br/>
+        <w:t xml:space="preserve"> 8:          END IF</w:t>
+        <w:br/>
+        <w:t xml:space="preserve"> 9:      END IF</w:t>
+        <w:br/>
+        <w:t>10:  END FOR</w:t>
+        <w:br/>
+        <w:t>11:  IF set E is empty THEN</w:t>
+        <w:br/>
+        <w:t>12:      RETURN Failure ("No candidate storage tier meets availability, latency, and budget requirements.")</w:t>
+        <w:br/>
+        <w:t>13:  END IF</w:t>
+        <w:br/>
+        <w:t>14:  Calculate C_min = min_{i in E}(C_i) and C_max = max_{i in E}(C_i)</w:t>
+        <w:br/>
+        <w:t>15:  FOR EACH tier i in E DO: U_i = 1.0 - (SLA_i / 100.0)</w:t>
+        <w:br/>
+        <w:t>16:  Calculate U_min = min_{i in E}(U_i) and U_max = max_{i in E}(U_i)</w:t>
+        <w:br/>
+        <w:t>17:  Calculate cost range C_range = C_max - C_min and unavailability range U_range = U_max - U_min</w:t>
+        <w:br/>
+        <w:t>18:  FOR EACH tier i in E DO:</w:t>
+        <w:br/>
+        <w:t>19:      C_norm(i) = (C_i - C_min) / C_range  IF C_range &gt; 0 ELSE 0.0</w:t>
+        <w:br/>
+        <w:t>20:      U_norm(i) = (U_i - U_min) / U_range  IF U_range &gt; 0 ELSE 0.0</w:t>
+        <w:br/>
+        <w:t>21:      Score_i   = alpha * C_norm(i) + beta * U_norm(i)</w:t>
+        <w:br/>
+        <w:t>22:  END FOR</w:t>
+        <w:br/>
+        <w:t>23:  Select optimal tier i* = argmin_{i in E}(Score_i)</w:t>
+        <w:br/>
+        <w:t>24:  Commit transaction record (S_req, SLA_req, Latency_req, B, alpha, beta, i*, C_i*, SLA_i*, timestamp)</w:t>
+        <w:br/>
+        <w:t xml:space="preserve">     to relational database allocations table</w:t>
+        <w:br/>
+        <w:t>25:  RETURN Success (i*, C_i*, SLA_i*, Latency_i*, Full Scoring Breakdown for set E)</w:t>
+      </w:r>
+    </w:p>
+    <w:p>
+      <w:pPr>
+        <w:spacing w:before="240" w:after="80" w:line="360" w:lineRule="auto"/>
+      </w:pPr>
+      <w:r/>
+      <w:r>
+        <w:rPr>
+          <w:rFonts w:ascii="Times New Roman" w:hAnsi="Times New Roman"/>
+          <w:b/>
+          <w:color w:val="000000"/>
+          <w:sz w:val="25"/>
+        </w:rPr>
+        <w:t>3.5.4 Comparative Baseline Allocation Algorithms</w:t>
+      </w:r>
+    </w:p>
+    <w:p>
+      <w:pPr>
+        <w:spacing w:before="0" w:after="120" w:line="360" w:lineRule="auto"/>
+      </w:pPr>
+      <w:r/>
+      <w:r>
+        <w:rPr>
+          <w:rFonts w:ascii="Times New Roman" w:hAnsi="Times New Roman"/>
+          <w:color w:val="000000"/>
+          <w:sz w:val="24"/>
+        </w:rPr>
+        <w:t>To evaluate the performance efficacy of the proposed heuristic, three classical baseline memory allocation heuristics adapted for cloud storage tiers are integrated for comparative benchmarking:</w:t>
+      </w:r>
+    </w:p>
+    <w:p>
+      <w:pPr>
+        <w:keepNext/>
+        <w:spacing w:before="280" w:after="80"/>
+        <w:jc w:val="center"/>
+      </w:pPr>
+      <w:r>
+        <w:drawing>
+          <wp:inline xmlns:a="http://schemas.openxmlformats.org/drawingml/2006/main" xmlns:pic="http://schemas.openxmlformats.org/drawingml/2006/picture">
+            <wp:extent cx="5303520" cy="3369295"/>
+            <wp:docPr id="10" name="Picture 10"/>
+            <wp:cNvGraphicFramePr>
+              <a:graphicFrameLocks noChangeAspect="1"/>
+            </wp:cNvGraphicFramePr>
+            <a:graphic>
+              <a:graphicData uri="http://schemas.openxmlformats.org/drawingml/2006/picture">
+                <pic:pic>
+                  <pic:nvPicPr>
+                    <pic:cNvPr id="0" name="image.png"/>
+                    <pic:cNvPicPr/>
+                  </pic:nvPicPr>
+                  <pic:blipFill>
+                    <a:blip r:embed="rId19"/>
+                    <a:stretch>
+                      <a:fillRect/>
+                    </a:stretch>
+                  </pic:blipFill>
+                  <pic:spPr>
+                    <a:xfrm>
+                      <a:off x="0" y="0"/>
+                      <a:ext cx="5303520" cy="3369295"/>
+                    </a:xfrm>
+                    <a:prstGeom prst="rect"/>
+                  </pic:spPr>
+                </pic:pic>
+              </a:graphicData>
+            </a:graphic>
+          </wp:inline>
+        </w:drawing>
+      </w:r>
+    </w:p>
+    <w:p>
+      <w:pPr>
+        <w:spacing w:before="40" w:after="280"/>
+        <w:jc w:val="center"/>
+      </w:pPr>
+      <w:r>
+        <w:rPr>
+          <w:rFonts w:ascii="Times New Roman" w:hAnsi="Times New Roman"/>
+          <w:b/>
+          <w:color w:val="000000"/>
+          <w:sz w:val="20"/>
+        </w:rPr>
+        <w:t xml:space="preserve">Figure 3.7: </w:t>
+      </w:r>
+      <w:r>
+        <w:rPr>
+          <w:rFonts w:ascii="Times New Roman" w:hAnsi="Times New Roman"/>
+          <w:i/>
+          <w:color w:val="000000"/>
+          <w:sz w:val="20"/>
+        </w:rPr>
+        <w:t>Screenshot Image of Algorithm 3.1: Pseudocode Logic of Core SLA-Aware Dual-Objective Heuristic Model.</w:t>
+      </w:r>
+    </w:p>
+    <w:p>
+      <w:pPr>
+        <w:spacing w:before="120" w:after="120" w:line="252" w:lineRule="auto"/>
+      </w:pPr>
+      <w:r/>
+      <w:r>
+        <w:rPr>
+          <w:rFonts w:ascii="Consolas" w:hAnsi="Consolas"/>
+          <w:color w:val="000000"/>
+          <w:sz w:val="19"/>
+        </w:rPr>
+        <w:t>Algorithm 3.2: Benchmark Storage Allocation Heuristics (First Fit, Best Fit, Worst Fit)</w:t>
+        <w:br/>
+        <w:t>----------------------------------------------------------------------------------------------------</w:t>
+        <w:br/>
+        <w:t>Procedure 1: First Fit Allocation (FF)</w:t>
+        <w:br/>
+        <w:t xml:space="preserve"> 1: FOR EACH storage tier i in database catalog T DO:</w:t>
+        <w:br/>
+        <w:t xml:space="preserve"> 2:     IF SLA_i &gt;= SLA_req AND Latency_i &lt;= Latency_req THEN</w:t>
+        <w:br/>
+        <w:t xml:space="preserve"> 3:         RETURN Tier i as First Fit Allocation Recommendation</w:t>
+        <w:br/>
+        <w:t xml:space="preserve"> 4:     END IF</w:t>
+        <w:br/>
+        <w:t xml:space="preserve"> 5: END FOR</w:t>
+        <w:br/>
+        <w:t xml:space="preserve"> 6: RETURN No Feasible Allocation</w:t>
+        <w:br/>
+        <w:br/>
+        <w:t>Procedure 2: Best Fit Allocation (BF)</w:t>
+        <w:br/>
+        <w:t xml:space="preserve"> 1: Filter feasible set E = { i in T | SLA_i &gt;= SLA_req AND Latency_i &lt;= Latency_req }</w:t>
+        <w:br/>
+        <w:t xml:space="preserve"> 2: IF E is empty THEN RETURN No Feasible Allocation</w:t>
+        <w:br/>
+        <w:t xml:space="preserve"> 3: FOR EACH tier i in E DO: Calculate excess availability ΔA_i = SLA_i - SLA_req</w:t>
+        <w:br/>
+        <w:t xml:space="preserve"> 4: Select tier i*_BF = argmin_{i in E}(ΔA_i)</w:t>
+        <w:br/>
+        <w:t xml:space="preserve"> 5: RETURN Tier i*_BF as Best Fit Allocation Recommendation</w:t>
+        <w:br/>
+        <w:br/>
+        <w:t>Procedure 3: Worst Fit Allocation (WF)</w:t>
+        <w:br/>
+        <w:t xml:space="preserve"> 1: Filter feasible set E = { i in T | SLA_i &gt;= SLA_req AND Latency_i &lt;= Latency_req }</w:t>
+        <w:br/>
+        <w:t xml:space="preserve"> 2: IF E is empty THEN RETURN No Feasible Allocation</w:t>
+        <w:br/>
+        <w:t xml:space="preserve"> 3: FOR EACH tier i in E DO: Calculate excess availability ΔA_i = SLA_i - SLA_req</w:t>
+        <w:br/>
+        <w:t xml:space="preserve"> 4: Select tier i*_WF = argmax_{i in E}(ΔA_i)</w:t>
+        <w:br/>
+        <w:t xml:space="preserve"> 5: RETURN Tier i*_WF as Worst Fit Allocation Recommendation</w:t>
+      </w:r>
+    </w:p>
+    <w:p>
+      <w:pPr>
+        <w:keepNext/>
+        <w:spacing w:before="280" w:after="80"/>
+        <w:jc w:val="center"/>
+      </w:pPr>
+      <w:r>
+        <w:drawing>
+          <wp:inline xmlns:a="http://schemas.openxmlformats.org/drawingml/2006/main" xmlns:pic="http://schemas.openxmlformats.org/drawingml/2006/picture">
+            <wp:extent cx="5303520" cy="2238368"/>
+            <wp:docPr id="12" name="Picture 12"/>
+            <wp:cNvGraphicFramePr>
+              <a:graphicFrameLocks noChangeAspect="1"/>
+            </wp:cNvGraphicFramePr>
+            <a:graphic>
+              <a:graphicData uri="http://schemas.openxmlformats.org/drawingml/2006/picture">
+                <pic:pic>
+                  <pic:nvPicPr>
+                    <pic:cNvPr id="0" name="algorithm_3_2_pseudocode.png"/>
+                    <pic:cNvPicPr/>
+                  </pic:nvPicPr>
+                  <pic:blipFill>
+                    <a:blip r:embed="rId20"/>
+                    <a:stretch>
+                      <a:fillRect/>
+                    </a:stretch>
+                  </pic:blipFill>
+                  <pic:spPr>
+                    <a:xfrm>
+                      <a:off x="0" y="0"/>
+                      <a:ext cx="5303520" cy="2238368"/>
+                    </a:xfrm>
+                    <a:prstGeom prst="rect"/>
+                  </pic:spPr>
+                </pic:pic>
+              </a:graphicData>
+            </a:graphic>
+          </wp:inline>
+        </w:drawing>
+      </w:r>
+    </w:p>
+    <w:p>
+      <w:pPr>
+        <w:keepNext/>
+        <w:spacing w:before="280" w:after="80"/>
+        <w:jc w:val="center"/>
+      </w:pPr>
+      <w:r>
+        <w:drawing>
+          <wp:inline xmlns:a="http://schemas.openxmlformats.org/drawingml/2006/main" xmlns:pic="http://schemas.openxmlformats.org/drawingml/2006/picture">
+            <wp:extent cx="5303520" cy="2303906"/>
+            <wp:docPr id="16" name="Picture 16"/>
+            <wp:cNvGraphicFramePr>
+              <a:graphicFrameLocks noChangeAspect="1"/>
+            </wp:cNvGraphicFramePr>
+            <a:graphic>
+              <a:graphicData uri="http://schemas.openxmlformats.org/drawingml/2006/picture">
+                <pic:pic>
+                  <pic:nvPicPr>
+                    <pic:cNvPr id="0" name="algorithm_3_2_pseudocode.png"/>
+                    <pic:cNvPicPr/>
+                  </pic:nvPicPr>
+                  <pic:blipFill>
+                    <a:blip r:embed="rId24"/>
+                    <a:stretch>
+                      <a:fillRect/>
+                    </a:stretch>
+                  </pic:blipFill>
+                  <pic:spPr>
+                    <a:xfrm>
+                      <a:off x="0" y="0"/>
+                      <a:ext cx="5303520" cy="2303906"/>
+                    </a:xfrm>
+                    <a:prstGeom prst="rect"/>
+                  </pic:spPr>
+                </pic:pic>
+              </a:graphicData>
+            </a:graphic>
+          </wp:inline>
+        </w:drawing>
+      </w:r>
+    </w:p>
+    <w:p>
+      <w:pPr>
+        <w:keepNext/>
+        <w:spacing w:before="280" w:after="80"/>
+        <w:jc w:val="center"/>
+      </w:pPr>
+      <w:r>
+        <w:drawing>
+          <wp:inline xmlns:a="http://schemas.openxmlformats.org/drawingml/2006/main" xmlns:pic="http://schemas.openxmlformats.org/drawingml/2006/picture">
+            <wp:extent cx="5303520" cy="2913911"/>
+            <wp:docPr id="19" name="Picture 19"/>
+            <wp:cNvGraphicFramePr>
+              <a:graphicFrameLocks noChangeAspect="1"/>
+            </wp:cNvGraphicFramePr>
+            <a:graphic>
+              <a:graphicData uri="http://schemas.openxmlformats.org/drawingml/2006/picture">
+                <pic:pic>
+                  <pic:nvPicPr>
+                    <pic:cNvPr id="0" name="algorithm_3_2_pseudocode.png"/>
+                    <pic:cNvPicPr/>
+                  </pic:nvPicPr>
+                  <pic:blipFill>
+                    <a:blip r:embed="rId27"/>
+                    <a:stretch>
+                      <a:fillRect/>
+                    </a:stretch>
+                  </pic:blipFill>
+                  <pic:spPr>
+                    <a:xfrm>
+                      <a:off x="0" y="0"/>
+                      <a:ext cx="5303520" cy="2913911"/>
+                    </a:xfrm>
+                    <a:prstGeom prst="rect"/>
+                  </pic:spPr>
+                </pic:pic>
+              </a:graphicData>
+            </a:graphic>
+          </wp:inline>
+        </w:drawing>
+      </w:r>
+    </w:p>
+    <w:p>
+      <w:pPr>
+        <w:spacing w:before="40" w:after="280"/>
+        <w:jc w:val="center"/>
+      </w:pPr>
+      <w:r>
+        <w:rPr>
+          <w:rFonts w:ascii="Times New Roman" w:hAnsi="Times New Roman"/>
+          <w:b/>
+          <w:color w:val="000000"/>
+          <w:sz w:val="20"/>
+        </w:rPr>
+        <w:t xml:space="preserve">Figure 3.8: </w:t>
+      </w:r>
+      <w:r>
+        <w:rPr>
+          <w:rFonts w:ascii="Times New Roman" w:hAnsi="Times New Roman"/>
+          <w:i/>
+          <w:color w:val="000000"/>
+          <w:sz w:val="20"/>
+        </w:rPr>
+        <w:t>Screenshot Image of Algorithm 3.2: Pseudocode Logic of Benchmark Allocation Heuristics (First Fit, Best Fit, Worst Fit).</w:t>
+      </w:r>
+    </w:p>
+    <w:p>
+      <w:pPr>
+        <w:spacing w:before="240" w:after="80" w:line="360" w:lineRule="auto"/>
+      </w:pPr>
+      <w:r/>
+      <w:r>
+        <w:rPr>
+          <w:rFonts w:ascii="Times New Roman" w:hAnsi="Times New Roman"/>
+          <w:b/>
+          <w:color w:val="000000"/>
+          <w:sz w:val="25"/>
+        </w:rPr>
+        <w:t>3.5.5 Automated Workload Estimation Models</w:t>
+      </w:r>
+    </w:p>
+    <w:p>
+      <w:pPr>
+        <w:spacing w:before="0" w:after="120" w:line="360" w:lineRule="auto"/>
+      </w:pPr>
+      <w:r/>
+      <w:r>
+        <w:rPr>
+          <w:rFonts w:ascii="Times New Roman" w:hAnsi="Times New Roman"/>
+          <w:color w:val="000000"/>
+          <w:sz w:val="24"/>
+        </w:rPr>
+        <w:t>To automate storage capacity planning, five empirical workload estimation models are incorporated into the system to calculate suggested storage capacity (S_suggested in GB) based on operational workload parameters:</w:t>
+      </w:r>
+    </w:p>
+    <w:p>
+      <w:pPr>
+        <w:keepNext/>
+        <w:spacing w:before="280" w:after="80"/>
+        <w:jc w:val="center"/>
+      </w:pPr>
+      <w:r>
+        <w:drawing>
+          <wp:inline xmlns:a="http://schemas.openxmlformats.org/drawingml/2006/main" xmlns:pic="http://schemas.openxmlformats.org/drawingml/2006/picture">
+            <wp:extent cx="5303520" cy="3369295"/>
+            <wp:docPr id="11" name="Picture 11"/>
+            <wp:cNvGraphicFramePr>
+              <a:graphicFrameLocks noChangeAspect="1"/>
+            </wp:cNvGraphicFramePr>
+            <a:graphic>
+              <a:graphicData uri="http://schemas.openxmlformats.org/drawingml/2006/picture">
+                <pic:pic>
+                  <pic:nvPicPr>
+                    <pic:cNvPr id="0" name="image.png"/>
+                    <pic:cNvPicPr/>
+                  </pic:nvPicPr>
+                  <pic:blipFill>
+                    <a:blip r:embed="rId19"/>
+                    <a:stretch>
+                      <a:fillRect/>
+                    </a:stretch>
+                  </pic:blipFill>
+                  <pic:spPr>
+                    <a:xfrm>
+                      <a:off x="0" y="0"/>
+                      <a:ext cx="5303520" cy="3369295"/>
+                    </a:xfrm>
+                    <a:prstGeom prst="rect"/>
+                  </pic:spPr>
+                </pic:pic>
+              </a:graphicData>
+            </a:graphic>
+          </wp:inline>
+        </w:drawing>
+      </w:r>
+    </w:p>
+    <w:p>
+      <w:pPr>
+        <w:spacing w:before="40" w:after="280"/>
+        <w:jc w:val="center"/>
+      </w:pPr>
+      <w:r>
+        <w:rPr>
+          <w:rFonts w:ascii="Times New Roman" w:hAnsi="Times New Roman"/>
+          <w:b/>
+          <w:color w:val="000000"/>
+          <w:sz w:val="20"/>
+        </w:rPr>
+        <w:t xml:space="preserve">Figure 3.7: </w:t>
+      </w:r>
+      <w:r>
+        <w:rPr>
+          <w:rFonts w:ascii="Times New Roman" w:hAnsi="Times New Roman"/>
+          <w:i/>
+          <w:color w:val="000000"/>
+          <w:sz w:val="20"/>
+        </w:rPr>
+        <w:t>Screenshot Image of Algorithm 3.1: Pseudocode Logic of Core SLA-Aware Dual-Objective Heuristic Model.</w:t>
+      </w:r>
+    </w:p>
+    <w:p>
+      <w:pPr>
+        <w:spacing w:before="120" w:after="120" w:line="252" w:lineRule="auto"/>
+      </w:pPr>
+      <w:r/>
+      <w:r>
+        <w:rPr>
+          <w:rFonts w:ascii="Consolas" w:hAnsi="Consolas"/>
+          <w:color w:val="000000"/>
+          <w:sz w:val="19"/>
+        </w:rPr>
+        <w:t>Algorithm 3.3: Automated Storage Workload Capacity Estimation Logic</w:t>
+        <w:br/>
+        <w:t>----------------------------------------------------------------------------------------------------</w:t>
+        <w:br/>
+        <w:t>1. Enterprise Relational Database (OLTP):</w:t>
+        <w:br/>
+        <w:t xml:space="preserve">   S_suggested = 20.0 + (Active_Users * 0.05) + (Monthly_Transactions * 0.0001)   [GB]</w:t>
+        <w:br/>
+        <w:br/>
+        <w:t>2. HD Video &amp; Media Streaming:</w:t>
+        <w:br/>
+        <w:t xml:space="preserve">   S_suggested = Media_File_Count * Avg_File_Size_GB   [GB]</w:t>
+        <w:br/>
+        <w:br/>
+        <w:t>3. IoT Sensor &amp; Log Analytics:</w:t>
+        <w:br/>
+        <w:t xml:space="preserve">   S_suggested = (IoT_Devices * Daily_Log_MB * Retention_Days) / 1024.0   [GB]</w:t>
+        <w:br/>
+        <w:br/>
+        <w:t>4. Document &amp; Content Management (CMS):</w:t>
+        <w:br/>
+        <w:t xml:space="preserve">   S_suggested = (Employees * Docs_per_Employee * Avg_Doc_MB) / 1024.0   [GB]</w:t>
+        <w:br/>
+        <w:br/>
+        <w:t>5. Cold Backup &amp; System Archive:</w:t>
+        <w:br/>
+        <w:t xml:space="preserve">   S_suggested = Snapshot_Size_GB * Retention_Snapshots   [GB]</w:t>
+      </w:r>
+    </w:p>
+    <w:p>
+      <w:pPr>
+        <w:keepNext/>
+        <w:spacing w:before="280" w:after="80"/>
+        <w:jc w:val="center"/>
+      </w:pPr>
+      <w:r>
+        <w:drawing>
+          <wp:inline xmlns:a="http://schemas.openxmlformats.org/drawingml/2006/main" xmlns:pic="http://schemas.openxmlformats.org/drawingml/2006/picture">
+            <wp:extent cx="5303520" cy="2460188"/>
+            <wp:docPr id="13" name="Picture 13"/>
+            <wp:cNvGraphicFramePr>
+              <a:graphicFrameLocks noChangeAspect="1"/>
+            </wp:cNvGraphicFramePr>
+            <a:graphic>
+              <a:graphicData uri="http://schemas.openxmlformats.org/drawingml/2006/picture">
+                <pic:pic>
+                  <pic:nvPicPr>
+                    <pic:cNvPr id="0" name="algorithm_3_3_pseudocode.png"/>
+                    <pic:cNvPicPr/>
+                  </pic:nvPicPr>
+                  <pic:blipFill>
+                    <a:blip r:embed="rId21"/>
+                    <a:stretch>
+                      <a:fillRect/>
+                    </a:stretch>
+                  </pic:blipFill>
+                  <pic:spPr>
+                    <a:xfrm>
+                      <a:off x="0" y="0"/>
+                      <a:ext cx="5303520" cy="2460188"/>
+                    </a:xfrm>
+                    <a:prstGeom prst="rect"/>
+                  </pic:spPr>
+                </pic:pic>
+              </a:graphicData>
+            </a:graphic>
+          </wp:inline>
+        </w:drawing>
+      </w:r>
+    </w:p>
+    <w:p>
+      <w:pPr>
+        <w:keepNext/>
+        <w:spacing w:before="280" w:after="80"/>
+        <w:jc w:val="center"/>
+      </w:pPr>
+      <w:r>
+        <w:drawing>
+          <wp:inline xmlns:a="http://schemas.openxmlformats.org/drawingml/2006/main" xmlns:pic="http://schemas.openxmlformats.org/drawingml/2006/picture">
+            <wp:extent cx="5303520" cy="2520684"/>
+            <wp:docPr id="17" name="Picture 17"/>
+            <wp:cNvGraphicFramePr>
+              <a:graphicFrameLocks noChangeAspect="1"/>
+            </wp:cNvGraphicFramePr>
+            <a:graphic>
+              <a:graphicData uri="http://schemas.openxmlformats.org/drawingml/2006/picture">
+                <pic:pic>
+                  <pic:nvPicPr>
+                    <pic:cNvPr id="0" name="algorithm_3_3_pseudocode.png"/>
+                    <pic:cNvPicPr/>
+                  </pic:nvPicPr>
+                  <pic:blipFill>
+                    <a:blip r:embed="rId25"/>
+                    <a:stretch>
+                      <a:fillRect/>
+                    </a:stretch>
+                  </pic:blipFill>
+                  <pic:spPr>
+                    <a:xfrm>
+                      <a:off x="0" y="0"/>
+                      <a:ext cx="5303520" cy="2520684"/>
+                    </a:xfrm>
+                    <a:prstGeom prst="rect"/>
+                  </pic:spPr>
+                </pic:pic>
+              </a:graphicData>
+            </a:graphic>
+          </wp:inline>
+        </w:drawing>
+      </w:r>
+    </w:p>
+    <w:p>
+      <w:pPr>
+        <w:keepNext/>
+        <w:spacing w:before="280" w:after="80"/>
+        <w:jc w:val="center"/>
+      </w:pPr>
+      <w:r>
+        <w:drawing>
+          <wp:inline xmlns:a="http://schemas.openxmlformats.org/drawingml/2006/main" xmlns:pic="http://schemas.openxmlformats.org/drawingml/2006/picture">
+            <wp:extent cx="5303520" cy="1693900"/>
+            <wp:docPr id="20" name="Picture 20"/>
+            <wp:cNvGraphicFramePr>
+              <a:graphicFrameLocks noChangeAspect="1"/>
+            </wp:cNvGraphicFramePr>
+            <a:graphic>
+              <a:graphicData uri="http://schemas.openxmlformats.org/drawingml/2006/picture">
+                <pic:pic>
+                  <pic:nvPicPr>
+                    <pic:cNvPr id="0" name="algorithm_3_3_pseudocode.png"/>
+                    <pic:cNvPicPr/>
+                  </pic:nvPicPr>
+                  <pic:blipFill>
+                    <a:blip r:embed="rId28"/>
+                    <a:stretch>
+                      <a:fillRect/>
+                    </a:stretch>
+                  </pic:blipFill>
+                  <pic:spPr>
+                    <a:xfrm>
+                      <a:off x="0" y="0"/>
+                      <a:ext cx="5303520" cy="1693900"/>
+                    </a:xfrm>
+                    <a:prstGeom prst="rect"/>
+                  </pic:spPr>
+                </pic:pic>
+              </a:graphicData>
+            </a:graphic>
+          </wp:inline>
+        </w:drawing>
+      </w:r>
+    </w:p>
+    <w:p>
+      <w:pPr>
+        <w:spacing w:before="40" w:after="280"/>
+        <w:jc w:val="center"/>
+      </w:pPr>
+      <w:r>
+        <w:rPr>
+          <w:rFonts w:ascii="Times New Roman" w:hAnsi="Times New Roman"/>
+          <w:b/>
+          <w:color w:val="000000"/>
+          <w:sz w:val="20"/>
+        </w:rPr>
+        <w:t xml:space="preserve">Figure 3.9: </w:t>
+      </w:r>
+      <w:r>
+        <w:rPr>
+          <w:rFonts w:ascii="Times New Roman" w:hAnsi="Times New Roman"/>
+          <w:i/>
+          <w:color w:val="000000"/>
+          <w:sz w:val="20"/>
+        </w:rPr>
+        <w:t>Screenshot Image of Algorithm 3.3: Pseudocode Logic of the Automated Storage Capacity Workload Estimation Engine.</w:t>
+      </w:r>
+    </w:p>
+    <w:p>
+      <w:pPr>
+        <w:spacing w:before="240" w:after="80" w:line="360" w:lineRule="auto"/>
+      </w:pPr>
+      <w:r/>
+      <w:r>
+        <w:rPr>
+          <w:rFonts w:ascii="Times New Roman" w:hAnsi="Times New Roman"/>
+          <w:b/>
+          <w:color w:val="000000"/>
+          <w:sz w:val="25"/>
+        </w:rPr>
+        <w:t>3.5.6 Complexity, Edge Case, and Sensitivity Analysis</w:t>
+      </w:r>
+    </w:p>
+    <w:p>
+      <w:pPr>
+        <w:spacing w:before="0" w:after="120" w:line="360" w:lineRule="auto"/>
+      </w:pPr>
+      <w:r/>
+      <w:r>
+        <w:rPr>
+          <w:rFonts w:ascii="Times New Roman" w:hAnsi="Times New Roman"/>
+          <w:color w:val="000000"/>
+          <w:sz w:val="24"/>
+        </w:rPr>
+        <w:t>The proposed algorithmic framework exhibits predictable mathematical properties under edge-case conditions and computational bounds:</w:t>
+      </w:r>
+    </w:p>
+    <w:p>
+      <w:pPr>
+        <w:spacing w:before="0" w:after="120" w:line="360" w:lineRule="auto"/>
+      </w:pPr>
+      <w:r/>
+      <w:r>
+        <w:rPr>
+          <w:rFonts w:ascii="Times New Roman" w:hAnsi="Times New Roman"/>
+          <w:color w:val="000000"/>
+          <w:sz w:val="24"/>
+        </w:rPr>
+        <w:t>• Computational Complexity: The algorithm iterates over candidate storage tiers T to pre-filter and compute normalized vectors. The overall time complexity is O(N), where N represents the total number of storage tiers in the database catalog (N = 6). Space complexity is O(N) auxiliary memory to retain candidate normalized scores. Execution speed is under 2 milliseconds, making it suitable for real-time storage allocation APIs.</w:t>
+      </w:r>
+    </w:p>
+    <w:p>
+      <w:pPr>
+        <w:spacing w:before="0" w:after="120" w:line="360" w:lineRule="auto"/>
+      </w:pPr>
+      <w:r/>
+      <w:r>
+        <w:rPr>
+          <w:rFonts w:ascii="Times New Roman" w:hAnsi="Times New Roman"/>
+          <w:color w:val="000000"/>
+          <w:sz w:val="24"/>
+        </w:rPr>
+        <w:t>• Edge Case - Single Eligible Tier (N_eligible = 1): When only one storage tier passes availability and latency constraints, C_max = C_min and U_max = U_min. Normalization ranges evaluate to zero (C_range = 0, U_range = 0). The algorithm handles zero-division by setting C_norm = 0.0 and U_norm = 0.0, yielding composite score S_1 = 0.0 and recommending the sole compliant tier.</w:t>
+      </w:r>
+    </w:p>
+    <w:p>
+      <w:pPr>
+        <w:spacing w:before="0" w:after="120" w:line="360" w:lineRule="auto"/>
+      </w:pPr>
+      <w:r/>
+      <w:r>
+        <w:rPr>
+          <w:rFonts w:ascii="Times New Roman" w:hAnsi="Times New Roman"/>
+          <w:color w:val="000000"/>
+          <w:sz w:val="24"/>
+        </w:rPr>
+        <w:t>• Edge Case - Empty Feasible Set (N_eligible = 0): If tight SLA availability (e.g. &gt;99.9999%) or ultra-low latency (e.g. &lt;0.1ms) requirements disqualify all catalog tiers, the algorithm gracefully returns a structured failure notification detailing the exact constraint breach.</w:t>
+      </w:r>
+    </w:p>
+    <w:p>
+      <w:pPr>
+        <w:spacing w:before="0" w:after="120" w:line="360" w:lineRule="auto"/>
+      </w:pPr>
+      <w:r/>
+      <w:r>
+        <w:rPr>
+          <w:rFonts w:ascii="Times New Roman" w:hAnsi="Times New Roman"/>
+          <w:color w:val="000000"/>
+          <w:sz w:val="24"/>
+        </w:rPr>
+        <w:t>• Weight Sensitivity Behavior: When α = 1.0 (cost-optimized mode, β = 0.0), composite score simplifies to S_i = C_norm(i), guaranteeing selection of the lowest-cost compliant tier. Conversely, when α = 0.0 (availability-optimized mode, β = 1.0), composite score simplifies to S_i = U_norm(i), guaranteeing selection of the highest availability SLA tier. Intermediate values (e.g., α = 0.5) provide smooth multi-objective trade-offs.</w:t>
+      </w:r>
+    </w:p>
+    <w:p>
+      <w:pPr>
+        <w:keepNext/>
+        <w:spacing w:before="280" w:after="80"/>
+        <w:jc w:val="center"/>
+      </w:pPr>
+      <w:r>
+        <w:drawing>
+          <wp:inline xmlns:a="http://schemas.openxmlformats.org/drawingml/2006/main" xmlns:pic="http://schemas.openxmlformats.org/drawingml/2006/picture">
+            <wp:extent cx="5303520" cy="11517178"/>
+            <wp:docPr id="14" name="Picture 14"/>
+            <wp:cNvGraphicFramePr>
+              <a:graphicFrameLocks noChangeAspect="1"/>
+            </wp:cNvGraphicFramePr>
+            <a:graphic>
+              <a:graphicData uri="http://schemas.openxmlformats.org/drawingml/2006/picture">
+                <pic:pic>
+                  <pic:nvPicPr>
+                    <pic:cNvPr id="0" name="activity_diagram.png"/>
+                    <pic:cNvPicPr/>
+                  </pic:nvPicPr>
+                  <pic:blipFill>
+                    <a:blip r:embed="rId22"/>
+                    <a:stretch>
+                      <a:fillRect/>
+                    </a:stretch>
+                  </pic:blipFill>
+                  <pic:spPr>
+                    <a:xfrm>
+                      <a:off x="0" y="0"/>
+                      <a:ext cx="5303520" cy="11517178"/>
+                    </a:xfrm>
+                    <a:prstGeom prst="rect"/>
+                  </pic:spPr>
+                </pic:pic>
+              </a:graphicData>
+            </a:graphic>
+          </wp:inline>
+        </w:drawing>
+      </w:r>
+    </w:p>
+    <w:p>
+      <w:pPr>
         <w:spacing w:line="360" w:lineRule="auto"/>
         <w:rPr>
           <w:color w:val="000000"/>
@@ -10285,6 +11459,243 @@
       </w:r>
       <w:r>
         <w:br/>
+      </w:r>
+    </w:p>
+    <w:p>
+      <w:pPr>
+        <w:spacing w:before="240" w:after="80" w:line="360" w:lineRule="auto"/>
+      </w:pPr>
+      <w:r/>
+      <w:r>
+        <w:rPr>
+          <w:rFonts w:ascii="Times New Roman" w:hAnsi="Times New Roman"/>
+          <w:b/>
+          <w:color w:val="000000"/>
+          <w:sz w:val="25"/>
+        </w:rPr>
+        <w:t>3.5.7 Conditional Parameter Sensitivity Analysis (If-Then Operational Scenarios)</w:t>
+      </w:r>
+    </w:p>
+    <w:p>
+      <w:pPr>
+        <w:spacing w:before="0" w:after="120" w:line="360" w:lineRule="auto"/>
+      </w:pPr>
+      <w:r/>
+      <w:r>
+        <w:rPr>
+          <w:rFonts w:ascii="Times New Roman" w:hAnsi="Times New Roman"/>
+          <w:color w:val="000000"/>
+          <w:sz w:val="24"/>
+        </w:rPr>
+        <w:t>The behavior of the allocation engine is fully deterministic and adapts dynamically based on parameter inputs. The following five conditional operational scenarios analyze how modifying specific parameters impacts candidate tier pre-filtering, vector normalization, and final tier selection across the 6 expanded catalog tiers:</w:t>
+      </w:r>
+    </w:p>
+    <w:p>
+      <w:pPr>
+        <w:spacing w:before="0" w:after="120" w:line="360" w:lineRule="auto"/>
+      </w:pPr>
+      <w:r/>
+      <w:r>
+        <w:rPr>
+          <w:rFonts w:ascii="Times New Roman" w:hAnsi="Times New Roman"/>
+          <w:color w:val="000000"/>
+          <w:sz w:val="24"/>
+        </w:rPr>
+        <w:t>• Scenario 1: IF Access Latency Limit (Latency_req) is Changed or Lowered:</w:t>
+        <w:br/>
+        <w:t xml:space="preserve">  - IF Latency_req is set to a strict sub-2.0 ms threshold (e.g. Latency_req = 1.0 ms for ultra-low latency transaction processing), THEN Premium SSD Block (2.0 ms), General Purpose Block (5.0 ms), File Storage (10.0 ms), Object Storage (25.0 ms), and Archive (100.0 ms) are physically disqualified during Phase 1 pre-filtering.</w:t>
+        <w:br/>
+        <w:t xml:space="preserve">  - THEN Ultra High-Performance NVMe Block Storage (0.5 ms) becomes the sole member of feasible set E and is selected automatically regardless of cost or the value of Alpha.</w:t>
+        <w:br/>
+        <w:t xml:space="preserve">  - IF Latency_req is relaxed to 25.0 ms (e.g. for general web applications), THEN 5 of the 6 storage tiers pass latency pre-filtering, enabling multi-objective scoring across multiple candidate tiers.</w:t>
+      </w:r>
+    </w:p>
+    <w:p>
+      <w:pPr>
+        <w:spacing w:before="0" w:after="120" w:line="360" w:lineRule="auto"/>
+      </w:pPr>
+      <w:r/>
+      <w:r>
+        <w:rPr>
+          <w:rFonts w:ascii="Times New Roman" w:hAnsi="Times New Roman"/>
+          <w:color w:val="000000"/>
+          <w:sz w:val="24"/>
+        </w:rPr>
+        <w:t>• Scenario 2: IF Availability SLA Target (SLA_req) is Changed or Raised:</w:t>
+        <w:br/>
+        <w:t xml:space="preserve">  - IF SLA_req is raised to 'Six Nines' (SLA_req = 99.9999% for mission-critical banking cores), THEN all tiers except Ultra High-Performance NVMe (99.9999%) fail the uptime check and are disqualified.</w:t>
+        <w:br/>
+        <w:t xml:space="preserve">  - THEN Ultra High-Performance NVMe is selected as the sole compliant tier.</w:t>
+        <w:br/>
+        <w:t xml:space="preserve">  - IF SLA_req is set to 99.0% (e.g. for non-critical archives), THEN all 6 storage tiers pass reliability pre-filtering, allowing cost weight Alpha to govern tier selection.</w:t>
+      </w:r>
+    </w:p>
+    <w:p>
+      <w:pPr>
+        <w:spacing w:before="0" w:after="120" w:line="360" w:lineRule="auto"/>
+      </w:pPr>
+      <w:r/>
+      <w:r>
+        <w:rPr>
+          <w:rFonts w:ascii="Times New Roman" w:hAnsi="Times New Roman"/>
+          <w:color w:val="000000"/>
+          <w:sz w:val="24"/>
+        </w:rPr>
+        <w:t>• Scenario 3: IF Cost Optimization Weight (α, Alpha) is Changed:</w:t>
+        <w:br/>
+        <w:t xml:space="preserve">  - IF Alpha is set to extreme cost focus (α = 1.0, β = 0.0), THEN unavailability is assigned 0% weight, and the algorithm selects the cheapest compliant tier (e.g. Cool System Archive at 0.004/GB or Hot Object Storage at 0.023/GB).</w:t>
+        <w:br/>
+        <w:t xml:space="preserve">  - IF Alpha is set to extreme availability focus (α = 0.0, β = 1.0), THEN cost is assigned 0% weight, and the algorithm selects the tier with highest SLA uptime (Ultra High-Performance NVMe at 99.9999%).</w:t>
+        <w:br/>
+        <w:t xml:space="preserve">  - IF Alpha is set to balanced weighting (α = 0.5, β = 0.5), THEN equal weight is given to normalized cost and unavailability, selecting High-Throughput File Storage ($0.060/GB).</w:t>
+      </w:r>
+    </w:p>
+    <w:p>
+      <w:pPr>
+        <w:spacing w:before="0" w:after="120" w:line="360" w:lineRule="auto"/>
+      </w:pPr>
+      <w:r/>
+      <w:r>
+        <w:rPr>
+          <w:rFonts w:ascii="Times New Roman" w:hAnsi="Times New Roman"/>
+          <w:color w:val="000000"/>
+          <w:sz w:val="24"/>
+        </w:rPr>
+        <w:t>• Scenario 4: IF Monthly Budget Constraint (B) is Imposed or Reduced:</w:t>
+        <w:br/>
+        <w:t xml:space="preserve">  - IF a budget limit B = 70.00 is imposed for a 1,000 GB workload, THEN NVMe Block (250.00/mo) and Premium SSD Block (150.00/mo) are disqualified for exceeding budget bounds.</w:t>
+        <w:br/>
+        <w:t xml:space="preserve">  - IF General Purpose Block (90.00/mo) is also above budget, THEN High-Throughput File Storage (60.00/mo) wins as the highest availability tier within budget.</w:t>
+        <w:br/>
+        <w:t xml:space="preserve">  - IF budget B is reduced below all compliant tier costs (e.g. B = 3.00), THEN feasible set E becomes empty (E = Ø), and execution halts safely with an explicit exception message.</w:t>
+      </w:r>
+    </w:p>
+    <w:p>
+      <w:pPr>
+        <w:spacing w:before="0" w:after="120" w:line="360" w:lineRule="auto"/>
+      </w:pPr>
+      <w:r/>
+      <w:r>
+        <w:rPr>
+          <w:rFonts w:ascii="Times New Roman" w:hAnsi="Times New Roman"/>
+          <w:color w:val="000000"/>
+          <w:sz w:val="24"/>
+        </w:rPr>
+        <w:t>• Scenario 5: IF Storage Capacity (S_req) Scales Up:</w:t>
+        <w:br/>
+        <w:t xml:space="preserve">  - IF requested storage capacity scales from 100 GB to 10,000 GB, THEN total monthly cost for each tier scales up linearly: C_i = cost_per_gb_i × S_req.</w:t>
+        <w:br/>
+        <w:t xml:space="preserve">  - THEN tiers that were affordable under small capacity requests may breach budget bounds B under large scale-up requests, dynamically shifting tier eligibility.</w:t>
+      </w:r>
+    </w:p>
+    <w:p>
+      <w:pPr>
+        <w:spacing w:before="240" w:after="80" w:line="360" w:lineRule="auto"/>
+      </w:pPr>
+      <w:r/>
+      <w:r>
+        <w:rPr>
+          <w:rFonts w:ascii="Times New Roman" w:hAnsi="Times New Roman"/>
+          <w:b/>
+          <w:color w:val="000000"/>
+          <w:sz w:val="25"/>
+        </w:rPr>
+        <w:t>3.5.8 Step-by-Step Optimization Process and Numerical Worked Example</w:t>
+      </w:r>
+    </w:p>
+    <w:p>
+      <w:pPr>
+        <w:spacing w:before="0" w:after="120" w:line="360" w:lineRule="auto"/>
+      </w:pPr>
+      <w:r/>
+      <w:r>
+        <w:rPr>
+          <w:rFonts w:ascii="Times New Roman" w:hAnsi="Times New Roman"/>
+          <w:color w:val="000000"/>
+          <w:sz w:val="24"/>
+        </w:rPr>
+        <w:t>The proposed heuristic algorithm executes through seven sequential operational steps:</w:t>
+      </w:r>
+    </w:p>
+    <w:p>
+      <w:pPr>
+        <w:spacing w:before="0" w:after="120" w:line="360" w:lineRule="auto"/>
+      </w:pPr>
+      <w:r/>
+      <w:r>
+        <w:rPr>
+          <w:rFonts w:ascii="Times New Roman" w:hAnsi="Times New Roman"/>
+          <w:color w:val="000000"/>
+          <w:sz w:val="24"/>
+        </w:rPr>
+        <w:t>Step 1 (Sizing): Determine requested storage capacity S_req in Gigabytes.</w:t>
+        <w:br/>
+        <w:t>Step 2 (Cost Calculation): Compute total monthly cost C_i = cost_per_gb_i × S_req for all catalog tiers.</w:t>
+        <w:br/>
+        <w:t>Step 3 (Hard Filtering): Remove tiers failing latency (Latency_i &gt; Latency_req), SLA (SLA_i &lt; SLA_req), or budget (C_i &gt; B).</w:t>
+        <w:br/>
+        <w:t>Step 4 (Unavailability Conversion): Convert SLA percentage to unavailability fraction U_i = 1.0 – (SLA_i / 100.0).</w:t>
+        <w:br/>
+        <w:t>Step 5 (Min-Max Range Scaling): Scale cost C_i and unavailability U_i into normalized [0.0, 1.0] bounds over eligible set E.</w:t>
+        <w:br/>
+        <w:t>Step 6 (Dual-Objective Scoring): Compute composite score S_i = α × C_norm(i) + β × U_norm(i).</w:t>
+        <w:br/>
+        <w:t>Step 7 (Optimal Selection &amp; Commitment): Select tier i* minimizing S_i and write transaction record to SQLite.</w:t>
+      </w:r>
+    </w:p>
+    <w:p>
+      <w:pPr>
+        <w:spacing w:before="0" w:after="120" w:line="360" w:lineRule="auto"/>
+      </w:pPr>
+      <w:r/>
+      <w:r>
+        <w:rPr>
+          <w:rFonts w:ascii="Times New Roman" w:hAnsi="Times New Roman"/>
+          <w:color w:val="000000"/>
+          <w:sz w:val="24"/>
+        </w:rPr>
+        <w:t>Comprehensive Numerical Worked Example (1,000 GB Request):</w:t>
+        <w:br/>
+        <w:t>• Input Parameters: S_req = 1,000 GB, SLA_req = 99.9%, Latency_req = 15.0 ms, Cost Weight α = 0.8, Availability Weight β = 0.2, Budget B = Unconstrained.</w:t>
+        <w:br/>
+        <w:t>• Candidate Tiers in Database Catalog:</w:t>
+        <w:br/>
+        <w:t xml:space="preserve">  1. Ultra High-Performance NVMe Block: 0.250/GB (250.00/mo), 99.9999% SLA, 0.5 ms latency.</w:t>
+        <w:br/>
+        <w:t xml:space="preserve">  2. Premium SSD Block Storage: 0.150/GB (150.00/mo), 99.999% SLA, 2.0 ms latency.</w:t>
+        <w:br/>
+        <w:t xml:space="preserve">  3. General Purpose Block Storage: 0.090/GB (90.00/mo), 99.95% SLA, 5.0 ms latency.</w:t>
+        <w:br/>
+        <w:t xml:space="preserve">  4. High-Throughput File Storage: 0.060/GB (60.00/mo), 99.99% SLA, 10.0 ms latency.</w:t>
+        <w:br/>
+        <w:t xml:space="preserve">  5. Hot Object Storage (S3): 0.023/GB (23.00/mo), 99.9% SLA, 25.0 ms latency.</w:t>
+        <w:br/>
+        <w:t xml:space="preserve">  6. Cool System Archive: 0.004/GB (4.00/mo), 99.0% SLA, 100.0 ms latency.</w:t>
+        <w:br/>
+        <w:br/>
+        <w:t>• Step-by-Step Execution:</w:t>
+        <w:br/>
+        <w:t xml:space="preserve">  1. Phase 1 Hard Filtering: Hot Object Storage (25.0 ms) and Cool Archive (100.0 ms) exceed Latency_req (15.0 ms) -&gt; Disqualified.</w:t>
+        <w:br/>
+        <w:t xml:space="preserve">     Feasible Set E = { NVMe Block, Premium SSD, General Purpose SSD, File Storage } (4 eligible tiers).</w:t>
+        <w:br/>
+        <w:t xml:space="preserve">  2. Phase 2 Cost &amp; Unavailability Bounds over E:</w:t>
+        <w:br/>
+        <w:t xml:space="preserve">     C_min = 60.00 (File Storage), C_max = 250.00 (NVMe Block), Cost Range = 190.00.</w:t>
+        <w:br/>
+        <w:t xml:space="preserve">     U_min = 0.000001 (NVMe Block), U_max = 0.0005 (General Purpose SSD), Unavail Range = 0.000499.</w:t>
+        <w:br/>
+        <w:t xml:space="preserve">  3. Phase 3 Vector Normalization &amp; Dual-Objective Scoring (α = 0.8, β = 0.2):</w:t>
+        <w:br/>
+        <w:t xml:space="preserve">     - NVMe Block: C_norm = (250-60)/190 = 1.0000, U_norm = (0.000001-0.000001)/range = 0.0000. Score = 0.8(1.0) + 0.2(0.0) = 0.8000.</w:t>
+        <w:br/>
+        <w:t xml:space="preserve">     - Premium SSD: C_norm = (150-60)/190 = 0.4737, U_norm = (0.00001-0.000001)/range = 0.0180. Score = 0.8(0.4737) + 0.2(0.0180) = 0.3826.</w:t>
+        <w:br/>
+        <w:t xml:space="preserve">     - General Purpose SSD: C_norm = (90-60)/190 = 0.1579, U_norm = (0.0005-0.000001)/range = 1.0000. Score = 0.8(0.1579) + 0.2(1.0000) = 0.3263.</w:t>
+        <w:br/>
+        <w:t xml:space="preserve">     - High-Throughput File Storage: C_norm = (60-60)/190 = 0.0000, U_norm = (0.0001-0.000001)/range = 0.1984. Score = 0.8(0.0000) + 0.2(0.1984) = 0.0397.</w:t>
+        <w:br/>
+        <w:t xml:space="preserve">  4. Optimal Selection: High-Throughput File Storage yields minimum score (0.0397) -&gt; Selected as Optimal Tier at 60.00/mo!</w:t>
       </w:r>
     </w:p>
     <w:p>

</xml_diff>

<commit_message>
refactor: update document generation to merge existing Word files instead of parsing markdown
</commit_message>
<xml_diff>
--- a/docs/Chap_1_2_3_Eunice.docx
+++ b/docs/Chap_1_2_3_Eunice.docx
@@ -6327,49 +6327,52 @@
         <w:jc w:val="both"/>
       </w:pPr>
       <w:r>
-        <w:t>This study specifically aims to:</w:t>
-      </w:r>
-    </w:p>
-    <w:p>
-      <w:pPr>
-        <w:spacing w:line="360" w:lineRule="auto"/>
-        <w:jc w:val="both"/>
-      </w:pPr>
-      <w:r>
-        <w:t xml:space="preserve">1. </w:t>
-      </w:r>
-      <w:r>
-        <w:t xml:space="preserve">Survey existing storage resource allocation approaches and their deficiencies in cost and SLA </w:t>
-      </w:r>
-      <w:r>
-        <w:t>-</w:t>
-      </w:r>
-      <w:r>
-        <w:t>awareness.</w:t>
-      </w:r>
-    </w:p>
-    <w:p>
-      <w:pPr>
-        <w:spacing w:line="360" w:lineRule="auto"/>
-        <w:jc w:val="both"/>
-      </w:pPr>
-      <w:r>
-        <w:t>2. Develop</w:t>
-      </w:r>
-      <w:r>
-        <w:t xml:space="preserve"> a heuristic-based heuristic model for storage resource allocation with cost and SLA as two-fold objectives.</w:t>
-      </w:r>
-    </w:p>
-    <w:p>
-      <w:pPr>
-        <w:spacing w:line="360" w:lineRule="auto"/>
-        <w:jc w:val="both"/>
-      </w:pPr>
-      <w:r>
-        <w:t xml:space="preserve">3. </w:t>
-      </w:r>
-      <w:r>
-        <w:t>Simulate the proposed heuristic approach using cloud storage workload traces.</w:t>
+        <w:t>The primary aim of this study is achieved through the following six specific operational objectives:</w:t>
+      </w:r>
+    </w:p>
+    <w:p>
+      <w:pPr>
+        <w:spacing w:line="360" w:lineRule="auto"/>
+        <w:jc w:val="both"/>
+      </w:pPr>
+      <w:r>
+        <w:t>1. To survey existing cloud storage allocation mechanisms and identify cost and SLA availability trade-off gaps.</w:t>
+      </w:r>
+    </w:p>
+    <w:p>
+      <w:pPr>
+        <w:spacing w:line="360" w:lineRule="auto"/>
+        <w:jc w:val="both"/>
+      </w:pPr>
+      <w:r>
+        <w:t>2. To formulate a dual-objective greedy heuristic algorithm balancing cost reduction and SLA availability guarantees.</w:t>
+      </w:r>
+    </w:p>
+    <w:p>
+      <w:pPr/>
+      <w:r>
+        <w:t>4. To construct a functional prototype web application platform for interactive simulation and optimization.</w:t>
+      </w:r>
+    </w:p>
+    <w:p>
+      <w:pPr/>
+      <w:r>
+        <w:t>5. To implement persistent allocation transaction logging and SLA compliance audit reporting mechanisms.</w:t>
+      </w:r>
+    </w:p>
+    <w:p>
+      <w:pPr/>
+      <w:r>
+        <w:t>6. To empirically evaluate system performance under varying workload patterns and trade-off priority weights.</w:t>
+      </w:r>
+    </w:p>
+    <w:p>
+      <w:pPr>
+        <w:spacing w:line="360" w:lineRule="auto"/>
+        <w:jc w:val="both"/>
+      </w:pPr>
+      <w:r>
+        <w:t>3. To develop an automated workload profile estimation engine for storage capacity recommendations.</w:t>
       </w:r>
     </w:p>
     <w:p>
@@ -10051,30 +10054,6 @@
           <w:color w:val="000000"/>
           <w:sz w:val="20"/>
         </w:rPr>
-        <w:t>Screenshot Image of Algorithm 3.1: Pseudocode Logic of Core SLA-Aware Dual-Objective Heuristic Model.</w:t>
-      </w:r>
-    </w:p>
-    <w:p>
-      <w:pPr>
-        <w:spacing w:before="40" w:after="280"/>
-        <w:jc w:val="center"/>
-      </w:pPr>
-      <w:r>
-        <w:rPr>
-          <w:rFonts w:ascii="Times New Roman" w:hAnsi="Times New Roman"/>
-          <w:b/>
-          <w:color w:val="000000"/>
-          <w:sz w:val="20"/>
-        </w:rPr>
-        <w:t xml:space="preserve">Figure 3.7: </w:t>
-      </w:r>
-      <w:r>
-        <w:rPr>
-          <w:rFonts w:ascii="Times New Roman" w:hAnsi="Times New Roman"/>
-          <w:i/>
-          <w:color w:val="000000"/>
-          <w:sz w:val="20"/>
-        </w:rPr>
         <w:t>Screenshot Image of Algorithm 3.1: Pseudocode Logic of the Core SLA-Aware Dual-Objective Storage Allocation Algorithm.</w:t>
       </w:r>
     </w:p>
@@ -10549,30 +10528,6 @@
     </w:p>
     <w:p>
       <w:pPr>
-        <w:spacing w:before="40" w:after="280"/>
-        <w:jc w:val="center"/>
-      </w:pPr>
-      <w:r>
-        <w:rPr>
-          <w:rFonts w:ascii="Times New Roman" w:hAnsi="Times New Roman"/>
-          <w:b/>
-          <w:color w:val="000000"/>
-          <w:sz w:val="20"/>
-        </w:rPr>
-        <w:t xml:space="preserve">Figure 3.7: </w:t>
-      </w:r>
-      <w:r>
-        <w:rPr>
-          <w:rFonts w:ascii="Times New Roman" w:hAnsi="Times New Roman"/>
-          <w:i/>
-          <w:color w:val="000000"/>
-          <w:sz w:val="20"/>
-        </w:rPr>
-        <w:t>Screenshot Image of Algorithm 3.1: Pseudocode Logic of Core SLA-Aware Dual-Objective Heuristic Model.</w:t>
-      </w:r>
-    </w:p>
-    <w:p>
-      <w:pPr>
         <w:spacing w:before="0" w:after="120" w:line="360" w:lineRule="auto"/>
       </w:pPr>
       <w:r/>
@@ -10624,30 +10579,6 @@
             </a:graphic>
           </wp:inline>
         </w:drawing>
-      </w:r>
-    </w:p>
-    <w:p>
-      <w:pPr>
-        <w:spacing w:before="40" w:after="280"/>
-        <w:jc w:val="center"/>
-      </w:pPr>
-      <w:r>
-        <w:rPr>
-          <w:rFonts w:ascii="Times New Roman" w:hAnsi="Times New Roman"/>
-          <w:b/>
-          <w:color w:val="000000"/>
-          <w:sz w:val="20"/>
-        </w:rPr>
-        <w:t xml:space="preserve">Figure 3.7: </w:t>
-      </w:r>
-      <w:r>
-        <w:rPr>
-          <w:rFonts w:ascii="Times New Roman" w:hAnsi="Times New Roman"/>
-          <w:i/>
-          <w:color w:val="000000"/>
-          <w:sz w:val="20"/>
-        </w:rPr>
-        <w:t>Screenshot Image of Algorithm 3.1: Pseudocode Logic of Core SLA-Aware Dual-Objective Heuristic Model.</w:t>
       </w:r>
     </w:p>
     <w:p>
@@ -10802,30 +10733,6 @@
     </w:p>
     <w:p>
       <w:pPr>
-        <w:spacing w:before="40" w:after="280"/>
-        <w:jc w:val="center"/>
-      </w:pPr>
-      <w:r>
-        <w:rPr>
-          <w:rFonts w:ascii="Times New Roman" w:hAnsi="Times New Roman"/>
-          <w:b/>
-          <w:color w:val="000000"/>
-          <w:sz w:val="20"/>
-        </w:rPr>
-        <w:t xml:space="preserve">Figure 3.7: </w:t>
-      </w:r>
-      <w:r>
-        <w:rPr>
-          <w:rFonts w:ascii="Times New Roman" w:hAnsi="Times New Roman"/>
-          <w:i/>
-          <w:color w:val="000000"/>
-          <w:sz w:val="20"/>
-        </w:rPr>
-        <w:t>Screenshot Image of Algorithm 3.1: Pseudocode Logic of Core SLA-Aware Dual-Objective Heuristic Model.</w:t>
-      </w:r>
-    </w:p>
-    <w:p>
-      <w:pPr>
         <w:spacing w:before="120" w:after="120" w:line="252" w:lineRule="auto"/>
       </w:pPr>
       <w:r/>
@@ -11095,30 +11002,6 @@
             </a:graphic>
           </wp:inline>
         </w:drawing>
-      </w:r>
-    </w:p>
-    <w:p>
-      <w:pPr>
-        <w:spacing w:before="40" w:after="280"/>
-        <w:jc w:val="center"/>
-      </w:pPr>
-      <w:r>
-        <w:rPr>
-          <w:rFonts w:ascii="Times New Roman" w:hAnsi="Times New Roman"/>
-          <w:b/>
-          <w:color w:val="000000"/>
-          <w:sz w:val="20"/>
-        </w:rPr>
-        <w:t xml:space="preserve">Figure 3.7: </w:t>
-      </w:r>
-      <w:r>
-        <w:rPr>
-          <w:rFonts w:ascii="Times New Roman" w:hAnsi="Times New Roman"/>
-          <w:i/>
-          <w:color w:val="000000"/>
-          <w:sz w:val="20"/>
-        </w:rPr>
-        <w:t>Screenshot Image of Algorithm 3.1: Pseudocode Logic of Core SLA-Aware Dual-Objective Heuristic Model.</w:t>
       </w:r>
     </w:p>
     <w:p>

</xml_diff>